<commit_message>
Rebuild site from refreshed sources; add chapter 12 to sidebar
Re-render the full Quarto site so docs/ reflects the fall content refresh
(commits ee40584..0fafed8), which updated sources only and left the
rendered site behind.

Add the missing "12. Animal Ethics" section to the _quarto.yml sidebar.
Chapter 12 was rendered and linked from the home page, but was the only
chapter unreachable from the sidebar nav.

Rebuild the EPUB and PDF editions, which pull case sources at build time
and were stale relative to the refreshed cases/.

Co-Authored-By: Claude Opus 5 <noreply@anthropic.com>
</commit_message>
<xml_diff>
--- a/docs/cases/03-alzheimers-fraud.docx
+++ b/docs/cases/03-alzheimers-fraud.docx
@@ -37,7 +37,7 @@
         <w:pStyle w:val="Date"/>
       </w:pPr>
       <w:r>
-        <w:t xml:space="preserve">2026-06-18</w:t>
+        <w:t xml:space="preserve">2026-08-03</w:t>
       </w:r>
     </w:p>
     <w:sdt>
@@ -1819,7 +1819,31 @@
         </w:numPr>
       </w:pPr>
       <w:r>
-        <w:t xml:space="preserve">Annual cost runs to about $26,000 per patient. That figure does not include infusion, monitoring MRI, or clinic fees, all of which Medicare now covers.</w:t>
+        <w:t xml:space="preserve">Annual list price runs to roughly $26,500 per patient. That figure does not include infusion, monitoring MRI, or clinic fees. Medicare Part B now covers the drug for patients meeting its criteria, leaving a 20% coinsurance of about $5,300 a year for anyone without supplemental coverage — a reminder that</w:t>
+      </w:r>
+      <w:r>
+        <w:t xml:space="preserve"> </w:t>
+      </w:r>
+      <w:r>
+        <w:t xml:space="preserve">“covered”</w:t>
+      </w:r>
+      <w:r>
+        <w:t xml:space="preserve"> </w:t>
+      </w:r>
+      <w:r>
+        <w:t xml:space="preserve">and</w:t>
+      </w:r>
+      <w:r>
+        <w:t xml:space="preserve"> </w:t>
+      </w:r>
+      <w:r>
+        <w:t xml:space="preserve">“affordable”</w:t>
+      </w:r>
+      <w:r>
+        <w:t xml:space="preserve"> </w:t>
+      </w:r>
+      <w:r>
+        <w:t xml:space="preserve">are different claims.</w:t>
       </w:r>
     </w:p>
     <w:p>

</xml_diff>